<commit_message>
Correct lesson 5 chord names and Classical and Romantic terminology
</commit_message>
<xml_diff>
--- a/content/storyboards/es/06-leccion-5.guion.docx
+++ b/content/storyboards/es/06-leccion-5.guion.docx
@@ -229,12 +229,12 @@
     </w:p>
     <w:p>
       <w:r>
-        <w:t>Con cinco, el acorde de onceava.</w:t>
+        <w:t>Con cinco, el acorde de oncena.</w:t>
       </w:r>
     </w:p>
     <w:p>
       <w:r>
-        <w:t>Y con seis terceras, el acorde de treceava.</w:t>
+        <w:t>Y con seis terceras, el acorde de trecena.</w:t>
       </w:r>
     </w:p>
     <w:p>
@@ -389,7 +389,7 @@
     </w:p>
     <w:p>
       <w:r>
-        <w:t>Después vienen Schubert, Chopin y Brahms, que en nuestra tabla aparecen como el periodo clásico.</w:t>
+        <w:t>Después vienen Schubert, Chopin y Brahms, que en nuestra tabla aparecen como el periodo clásico y romántico.</w:t>
       </w:r>
     </w:p>
     <w:p>
@@ -634,7 +634,7 @@
     </w:p>
     <w:p>
       <w:r>
-        <w:t>Los acordes se construyen superponiendo terceras, desde el acorde de quinta hasta el de treceava.</w:t>
+        <w:t>Los acordes se construyen superponiendo terceras, desde el acorde de quinta hasta el de trecena.</w:t>
       </w:r>
     </w:p>
     <w:p>

</xml_diff>